<commit_message>
Firm up CX stats to Gartner primaries; use live URLs for published posts
CX article: replace the secondary citation for the 91% executive-pressure
and "50% rehire by 2027 / ~20% actually cut staff" stats with Gartner's
own press releases (Feb 18 2026 and Feb 3 2026).

Collection-wide: swap the two now-live TransPerfect URLs into all
cross-links, One Name, Six Spellings (KYC) and From Sponsor to Customer
(Viamericas/Revolut), and update the placeholder notes so only the
not-yet-published Buying Loyalty post is flagged. Rebuilt affected Word
files. No em dashes.

Co-Authored-By: Claude Opus 4.8 <noreply@anthropic.com>
Claude-Session: https://claude.ai/code/session_01WdmaS8fb3WHmxD5MVo6UfL
</commit_message>
<xml_diff>
--- a/blog/Accessibility-Disability-Inclusion-Financial-Services.docx
+++ b/blog/Accessibility-Disability-Inclusion-Financial-Services.docx
@@ -67,7 +67,7 @@
         </w:rPr>
         <w:t xml:space="preserve">Start with the scale of who is being left out. In the United States, </w:t>
       </w:r>
-      <w:hyperlink w:history="1" r:id="rIdebxx2xfbpe7oddezdurfj">
+      <w:hyperlink w:history="1" r:id="rIdaukqrrd0gzaxpsukdkqbw">
         <w:r>
           <w:rPr>
             <w:rStyle w:val="Hyperlink"/>
@@ -84,7 +84,7 @@
         </w:rPr>
         <w:t xml:space="preserve">, and globally the number reaches </w:t>
       </w:r>
-      <w:hyperlink w:history="1" r:id="rIdycu3gm5dxgtxkyi6-6sba">
+      <w:hyperlink w:history="1" r:id="rIduxo8qgiwwm-yzgkfnc9ca">
         <w:r>
           <w:rPr>
             <w:rStyle w:val="Hyperlink"/>
@@ -101,7 +101,7 @@
         </w:rPr>
         <w:t xml:space="preserve">, the population the Valuable 500 movement exists to stop excluding. This is not a fringe. It is one of the largest underserved markets on earth, with an estimated </w:t>
       </w:r>
-      <w:hyperlink w:history="1" r:id="rIdpduyg6olfaszmzn3wnpxm">
+      <w:hyperlink w:history="1" r:id="rId71-iah0kmelwos25xbcci">
         <w:r>
           <w:rPr>
             <w:rStyle w:val="Hyperlink"/>
@@ -118,7 +118,7 @@
         </w:rPr>
         <w:t xml:space="preserve"> in the U.S. alone. TransPerfect's </w:t>
       </w:r>
-      <w:hyperlink w:history="1" r:id="rIdeflpwas8uqwgyoyw3pbso">
+      <w:hyperlink w:history="1" r:id="rIdtl0yk9pulnrolhzyu0sft">
         <w:r>
           <w:rPr>
             <w:rStyle w:val="Hyperlink"/>
@@ -249,7 +249,7 @@
         </w:rPr>
         <w:t xml:space="preserve">In Europe, the </w:t>
       </w:r>
-      <w:hyperlink w:history="1" r:id="rId5chcsns_aayonbig1angy">
+      <w:hyperlink w:history="1" r:id="rIdpr1hya8th-srzdjkbgd40">
         <w:r>
           <w:rPr>
             <w:rStyle w:val="Hyperlink"/>
@@ -266,7 +266,7 @@
         </w:rPr>
         <w:t xml:space="preserve">, and banking is explicitly in scope. Consumer banking websites, mobile apps, authentication flows, and self-service terminals must now be accessible, with </w:t>
       </w:r>
-      <w:hyperlink w:history="1" r:id="rIds_mq8xqc91d5hlxbbrkgb">
+      <w:hyperlink w:history="1" r:id="rIdwhnpevnhsqeqxyid39wj1">
         <w:r>
           <w:rPr>
             <w:rStyle w:val="Hyperlink"/>
@@ -295,7 +295,7 @@
         </w:rPr>
         <w:t xml:space="preserve">In the United States, the pressure comes through litigation and supervision. Website accessibility lawsuits have run </w:t>
       </w:r>
-      <w:hyperlink w:history="1" r:id="rId3xlulht9igq1pvbd08zhw">
+      <w:hyperlink w:history="1" r:id="rIdvdzn_lmhsc1jvgt9wctid">
         <w:r>
           <w:rPr>
             <w:rStyle w:val="Hyperlink"/>
@@ -312,7 +312,7 @@
         </w:rPr>
         <w:t xml:space="preserve">, and after a brief dip they </w:t>
       </w:r>
-      <w:hyperlink w:history="1" r:id="rIdxahm9xk3fret6jgy1c8hw">
+      <w:hyperlink w:history="1" r:id="rIdcole6ieyrgnyssn_-emv6">
         <w:r>
           <w:rPr>
             <w:rStyle w:val="Hyperlink"/>
@@ -329,7 +329,7 @@
         </w:rPr>
         <w:t xml:space="preserve">. Financial services is squarely in the crosshairs: law firm Morgan Lewis has documented an </w:t>
       </w:r>
-      <w:hyperlink w:history="1" r:id="rIdxp0bl70nsmafr0lmcabth">
+      <w:hyperlink w:history="1" r:id="rId_3ly1dr4p6zclacl9deho">
         <w:r>
           <w:rPr>
             <w:rStyle w:val="Hyperlink"/>
@@ -358,7 +358,7 @@
         </w:rPr>
         <w:t xml:space="preserve">A word of caution for anyone hoping to buy their way out cheaply: automated accessibility overlays and widgets are not a defense. A quarter of 2024 web-accessibility suits </w:t>
       </w:r>
-      <w:hyperlink w:history="1" r:id="rId37gdg83k2bhufizzyo6_s">
+      <w:hyperlink w:history="1" r:id="rIddf58lwex-_6g60xkad-bm">
         <w:r>
           <w:rPr>
             <w:rStyle w:val="Hyperlink"/>
@@ -414,7 +414,7 @@
         </w:rPr>
         <w:t xml:space="preserve">It covers the whole digital estate, web, mobile apps, and increasingly AI-driven interfaces, tested against </w:t>
       </w:r>
-      <w:hyperlink w:history="1" r:id="rIdbgosivos0fanpx3xdvii1">
+      <w:hyperlink w:history="1" r:id="rIdra7hmgqzwiseyptojxz28">
         <w:r>
           <w:rPr>
             <w:rStyle w:val="Hyperlink"/>
@@ -431,7 +431,7 @@
         </w:rPr>
         <w:t xml:space="preserve">, EN 301 549, and Section 508, not self-attested but confirmed through independent audits with conformance reporting (the ACR and VPAT documents that procurement and litigation both ask for). Automated scanners have a role, but they detect only a fraction of real barriers; genuine conformance still depends on expert human testing, including review by people who use assistive technology, which is why </w:t>
       </w:r>
-      <w:hyperlink w:history="1" r:id="rIdilp0xvcpf9lrhri-e3edz">
+      <w:hyperlink w:history="1" r:id="rIdalbpmeas3lmpntmtlyb4f">
         <w:r>
           <w:rPr>
             <w:rStyle w:val="Hyperlink"/>
@@ -472,7 +472,7 @@
         </w:rPr>
         <w:t xml:space="preserve">The best programs then close the loop with the human-facing services that turn conformance into inclusion: ASL interpretation and text-to-speech that make banking usable in the customer's own language and modality. This is not theoretical. </w:t>
       </w:r>
-      <w:hyperlink w:history="1" r:id="rIdj-s4_b5smffazfyi6lful">
+      <w:hyperlink w:history="1" r:id="rIdwjf2_rqq4vbxsiqtnivej">
         <w:r>
           <w:rPr>
             <w:rStyle w:val="Hyperlink"/>
@@ -574,7 +574,7 @@
         </w:rPr>
         <w:t xml:space="preserve"> </w:t>
       </w:r>
-      <w:hyperlink w:history="1" r:id="rIdvf9lijiiy-7sunryyzdzs">
+      <w:hyperlink w:history="1" r:id="rIdo9wibzdgurj5ipwke2a21">
         <w:r>
           <w:rPr>
             <w:rStyle w:val="Hyperlink"/>
@@ -591,7 +591,7 @@
         </w:rPr>
         <w:t xml:space="preserve"> and </w:t>
       </w:r>
-      <w:hyperlink w:history="1" r:id="rIdnbi6nd50kwd7ltre-ufmp">
+      <w:hyperlink w:history="1" r:id="rId1ze-dunbdajtey_e_srh0">
         <w:r>
           <w:rPr>
             <w:rStyle w:val="Hyperlink"/>
@@ -608,7 +608,7 @@
         </w:rPr>
         <w:t xml:space="preserve">, plus our finance series: </w:t>
       </w:r>
-      <w:hyperlink w:history="1" r:id="rIdf7vieeqzkyhcdmppnxwxt">
+      <w:hyperlink w:history="1" r:id="rId91bhssjlln-zkdyboykal">
         <w:r>
           <w:rPr>
             <w:rStyle w:val="Hyperlink"/>
@@ -625,7 +625,7 @@
         </w:rPr>
         <w:t xml:space="preserve">, </w:t>
       </w:r>
-      <w:hyperlink w:history="1" r:id="rIdfg920qa3o5po-lcg68cuy">
+      <w:hyperlink w:history="1" r:id="rIdlpdgnogyamrnpz1puh37d">
         <w:r>
           <w:rPr>
             <w:rStyle w:val="Hyperlink"/>
@@ -642,14 +642,14 @@
         </w:rPr>
         <w:t xml:space="preserve">, and </w:t>
       </w:r>
-      <w:hyperlink w:history="1" r:id="rIdy557oqnknbouf7anyuu-u">
-        <w:r>
-          <w:rPr>
-            <w:rStyle w:val="Hyperlink"/>
-            <w:sz w:val="22"/>
-            <w:szCs w:val="22"/>
-          </w:rPr>
-          <w:t xml:space="preserve">NYCFC Names Viamericas Its Remittance Partner</w:t>
+      <w:hyperlink w:history="1" r:id="rIdhkjwkznvawquqzkmbbrfu">
+        <w:r>
+          <w:rPr>
+            <w:rStyle w:val="Hyperlink"/>
+            <w:sz w:val="22"/>
+            <w:szCs w:val="22"/>
+          </w:rPr>
+          <w:t xml:space="preserve">From Sponsor to Customer: Fintech's New Sports Playbook</w:t>
         </w:r>
       </w:hyperlink>
       <w:r>
@@ -666,7 +666,7 @@
           <w:sz w:val="22"/>
           <w:szCs w:val="22"/>
         </w:rPr>
-        <w:t xml:space="preserve">(external finance-series URLs are placeholders, swap for live)</w:t>
+        <w:t xml:space="preserve">(Buying Loyalty URL is a placeholder)</w:t>
       </w:r>
       <w:r>
         <w:rPr>
@@ -734,7 +734,7 @@
         </w:rPr>
         <w:t xml:space="preserve"> (~61 million). </w:t>
       </w:r>
-      <w:hyperlink w:history="1" r:id="rIdbqmhu2xxuouse68-bwel1">
+      <w:hyperlink w:history="1" r:id="rIdi7cskq7cjlimft527e9f6">
         <w:r>
           <w:rPr>
             <w:rStyle w:val="Hyperlink"/>
@@ -761,7 +761,7 @@
         </w:rPr>
         <w:t xml:space="preserve">The Valuable 500 (global movement to end disability exclusion; 1.3 billion people). </w:t>
       </w:r>
-      <w:hyperlink w:history="1" r:id="rIdw2lg6wp0e_ivb6_k0ex9c">
+      <w:hyperlink w:history="1" r:id="rIdqvzkaxoxo-_nrjukjmqir">
         <w:r>
           <w:rPr>
             <w:rStyle w:val="Hyperlink"/>
@@ -778,7 +778,7 @@
         </w:rPr>
         <w:t xml:space="preserve"> · TransPerfect recognition: </w:t>
       </w:r>
-      <w:hyperlink w:history="1" r:id="rId7mf8etzd5khcqx3hzuxwy">
+      <w:hyperlink w:history="1" r:id="rIdujthgaeiqwpq9rm14kg5n">
         <w:r>
           <w:rPr>
             <w:rStyle w:val="Hyperlink"/>
@@ -821,7 +821,7 @@
         </w:rPr>
         <w:t xml:space="preserve"> (~$490B disposable income). </w:t>
       </w:r>
-      <w:hyperlink w:history="1" r:id="rId5rdskzfjxqgyw1rohv6ym">
+      <w:hyperlink w:history="1" r:id="rIdvpancxfjnco5nwm6frbvz">
         <w:r>
           <w:rPr>
             <w:rStyle w:val="Hyperlink"/>
@@ -848,7 +848,7 @@
         </w:rPr>
         <w:t xml:space="preserve">European Accessibility Act (effective June 28, 2025; banking in scope; EN 301 549 / WCAG AA): </w:t>
       </w:r>
-      <w:hyperlink w:history="1" r:id="rIdckeo3lrl-e7nur_02uych">
+      <w:hyperlink w:history="1" r:id="rIdrtpvrhi41wipbflw19vlg">
         <w:r>
           <w:rPr>
             <w:rStyle w:val="Hyperlink"/>
@@ -865,7 +865,7 @@
         </w:rPr>
         <w:t xml:space="preserve"> · </w:t>
       </w:r>
-      <w:hyperlink w:history="1" r:id="rIdouuz1idrgaykpsdbk1opa">
+      <w:hyperlink w:history="1" r:id="rIddznsfksknazbn2qrw2q6z">
         <w:r>
           <w:rPr>
             <w:rStyle w:val="Hyperlink"/>
@@ -892,7 +892,7 @@
         </w:rPr>
         <w:t xml:space="preserve">ADA web-accessibility litigation trends (thousands per year; 2025 rebound to 3,100+ federal; overlays cited as barriers): </w:t>
       </w:r>
-      <w:hyperlink w:history="1" r:id="rId50x8sdwv_bx3eyynbadkk">
+      <w:hyperlink w:history="1" r:id="rIdcgfj99bbimxtrdmuc5y4q">
         <w:r>
           <w:rPr>
             <w:rStyle w:val="Hyperlink"/>
@@ -909,7 +909,7 @@
         </w:rPr>
         <w:t xml:space="preserve"> · </w:t>
       </w:r>
-      <w:hyperlink w:history="1" r:id="rId08gwe04q2zjg3u7ypalyy">
+      <w:hyperlink w:history="1" r:id="rIddvw4ehjuudxqn-vhua9f4">
         <w:r>
           <w:rPr>
             <w:rStyle w:val="Hyperlink"/>
@@ -952,7 +952,7 @@
         </w:rPr>
         <w:t xml:space="preserve"> (2024). </w:t>
       </w:r>
-      <w:hyperlink w:history="1" r:id="rIdp4h-uwd0hdtqin6yqygw0">
+      <w:hyperlink w:history="1" r:id="rIdnxlknltylycy24r-8ugxg">
         <w:r>
           <w:rPr>
             <w:rStyle w:val="Hyperlink"/>
@@ -995,7 +995,7 @@
         </w:rPr>
         <w:t xml:space="preserve">. </w:t>
       </w:r>
-      <w:hyperlink w:history="1" r:id="rIdiq817wmiqc_q3yi3eb8cn">
+      <w:hyperlink w:history="1" r:id="rIdficx9begr0ynpnx01efr9">
         <w:r>
           <w:rPr>
             <w:rStyle w:val="Hyperlink"/>
@@ -1038,7 +1038,7 @@
         </w:rPr>
         <w:t xml:space="preserve"> (public text-to-speech statements, ASL interpreters, WCAG 2.2 AA). </w:t>
       </w:r>
-      <w:hyperlink w:history="1" r:id="rIdyeish_dhyk78u6ouebgfp">
+      <w:hyperlink w:history="1" r:id="rIdmwpmhlokv3vamyj_kx7hq">
         <w:r>
           <w:rPr>
             <w:rStyle w:val="Hyperlink"/>

</xml_diff>